<commit_message>
Auto commit (2026-10-16 14:37) — 2 changes
Claude Code 세션 종료 시 자동 커밋.

Co-Authored-By: Claude <noreply@anthropic.com>
Claude-Session: https://claude.ai/code/01ff7141-4325-41c8-8957-0eef3aa7c961
</commit_message>
<xml_diff>
--- a/projects/44_blind_heiress_dog/The Blind Heiress Sees Everything_회차 트리트먼트_1-50화.docx
+++ b/projects/44_blind_heiress_dog/The Blind Heiress Sees Everything_회차 트리트먼트_1-50화.docx
@@ -324,7 +324,7 @@
           <w:b w:val="0"/>
           <w:sz w:val="20"/>
         </w:rPr>
-        <w:t>티파니가 이를 악물고 나가자, 마크는 오드리를 1인 병실로 옮기고 피 묻은 얼굴을 닦아 준다. 마크는 그 여자가 자기를 쫓아다니는 미친 여자고, 타일러는 처음 듣는 이름이라고 한다. 그때 마크 휴대폰에 티파니의 문자가 뜨고, 오드리 눈이 자기도 모르게 화면으로 간다. 왜 그러냐는 마크에게 오드리는 당신 목소리가 그쪽에서 들려서 고개가 돌아갔다고 둘러댄다. 마크가 한숨 자라고 해서 오드리가 눈을 감자, 티파니가 들어와 마크에게 입을 맞추고 넥타이를 풀며 침대 옆 소파로 끌어당긴다. 마크는 아내가 실눈 사이로 다 보고 있다는 걸 모른다.</w:t>
+        <w:t>티파니가 이를 악물고 복도를 나가자, 마크는 오드리를 이름 없는 환자로 둔 채 1인 병실로 옮기고 피 묻은 얼굴을 닦아 준다. 마크는 그 여자가 자기를 쫓아다니는 미친 여자고, 타일러는 처음 듣는 이름이라고 한다. 그때 마크 휴대폰에 티파니의 문자가 뜨고, 오드리 눈이 자기도 모르게 화면으로 간다. 왜 그러냐는 마크에게 오드리는 당신 목소리가 그 휴대폰 쪽에서 들려서 고개가 돌아갔다고 둘러댄다. 마크가 한숨 자라고 해서 오드리가 눈을 감자, 티파니가 들어와 마크에게 입을 맞추고 침대 옆 소파로 끌어당긴다. 마크는 아내가 실눈 사이로 다 보고 있다는 걸 모른다.</w:t>
       </w:r>
     </w:p>
     <w:p>
@@ -350,7 +350,7 @@
           <w:b w:val="0"/>
           <w:sz w:val="20"/>
         </w:rPr>
-        <w:t>셔츠 단추가 반쯤 풀린 마크는 티파니를 무릎에 앉힌 채, 어차피 못 보는 여자라고 웃으며 안주머니에서 위임장을 꺼낸다. 내일 밤 상장식 종이 울리기 전에 웰스 가문 서명이 들어가야 50억 달러가 움직인다. 마크는 침대 식판 위에서 오드리 이름을 열네 번 연습한 뒤 위임장에 오드리 서명을 해 넣는다. 오드리 뺨으로 눈물이 흐르자 티파니가 깨어 있는 거 아니냐고 묻지만, 마크는 3년 내내 자면서도 울던 여자라고 한다. 상장식장으로 떠나며 마크가 티파니에게 이른다. 「종 칠 때까지만 아무도 못 보게 해. 그다음엔 네 마음대로 해.」</w:t>
+        <w:t>셔츠 단추가 반쯤 풀린 마크는 티파니를 무릎에 앉힌 채, 어차피 못 보는 여자라고 웃으며 안주머니에서 위임장을 꺼낸다. 내일 밤 상장식 종이 울리기 전에 웰스 가문 서명이 들어가야 50억 달러가 움직인다. 마크는 식판 위 종이에 오드리 이름을 열네 번 연습한 뒤, 위임장에 오드리 서명을 해 넣는다. 오드리 뺨으로 눈물이 흐르자 티파니가 깨어 있는 거 아니냐고 묻지만, 마크는 3년 내내 자면서도 울던 여자라고 한다. 상장식 준비를 하러 떠나며 마크가 티파니에게 이른다. 「종 칠 때까지만 아무도 못 보게 해. 그다음엔 네 마음대로 해.」</w:t>
       </w:r>
     </w:p>
     <w:p>
@@ -376,7 +376,7 @@
           <w:b w:val="0"/>
           <w:sz w:val="20"/>
         </w:rPr>
-        <w:t>티파니는 비서실장을 불러 오드리를 지하 격리실로 내리고 쇠 의자에 묶는다. 칭얼대던 타일러가 비서실장 목에 익숙하게 매달리고, 오드리는 그것도 본다. 티파니는 마크가 오드리를 자기한테 넘기고 갔다고, 베어는 벌써 분쇄기에 들어갔다고 웃는다. 그런데 티파니 휴대폰 화면에는 병원 뒷마당 녹슨 철창 속 베어 사진이 떠 있다. 타일러가 저 아줌마가 엄마 폰을 본다고 하자, 티파니는 장님이 뭘 보냐며 웃어넘기고 응급실 의사를 돌아본다. 「대표님이 맡긴 일이에요. 비명이 위층까지만 안 들리게 해 줘요.」</w:t>
+        <w:t>마크가 나가자 티파니는 비서실장에게 올라오라고 전화하고, 그 사이 오드리는 물컵을 찾는 척 식판을 더듬는다. 티파니가 비웃으며 물컵을 손에 밀어 주는 동안, 오드리의 다른 손은 마크가 서명을 연습한 종이를 접어 환자복 안에 넣는다. 곧 비서실장이 졸린 타일러를 안고 들어오고, 타일러는 비서실장 목에 익숙하게 매달려 떨어지지 않는다. 오드리는 그것도 본다. 티파니가 비서실장에게 이른다. 「안과 검사실로 데려가. 밤엔 비어 있으니까. 장님한테 딱 맞는 방이잖아.」</w:t>
       </w:r>
     </w:p>
     <w:p>
@@ -402,7 +402,7 @@
           <w:b w:val="0"/>
           <w:sz w:val="20"/>
         </w:rPr>
-        <w:t>의사가 마지못해 수술 도구 상자를 가져오자, 티파니는 그중에서 전동 공구를 집어 든다. 그 시각 상장식장에서 리허설을 하던 마크는, 병원 복도 영상이 퍼지며 포스터 대표의 숨겨 둔 아내라는 말이 돈다는 보고를 받는다. 티파니가 전화를 받지 않자 마크는 차에 올라 서랍에서 총을 꺼낸다. 마크는 아내를 구하러 가는 게 아니라, 기자들이 아내를 찾아내기 전에 아내 입을 막으러 간다. 같은 시각 폭풍을 뚫고 뉴욕에 내린 오빠의 화면에, 끊겼던 오드리 신호가 다시 잡힌다. 지하실에서는 티파니가 공구를 켠다.</w:t>
+        <w:t>응급실 의사가 대표님이 맡기고 간 일이라는 말에 안과 열쇠를 내주고, 비서실장은 불 꺼진 검사실 의자에 오드리를 묶는다. 티파니는 타일러에게 휴대폰을 보여 주며, 조르던 박제를 아침까지 방에 세워 주겠다고 웃는다. 화면 속 베어는 박제소 케이지에 갇혀 있고, 케이지에는 '타일러 방'이라고 적힌 주문표가 붙어 있다. 티파니는 오드리 귀에 대고 그 개는 벌써 죽었다고 속삭이지만, 방금 찍힌 사진 속 베어는 눈을 뜨고 있다. 타일러가 저 아줌마가 엄마 폰을 본다고 하자, 티파니는 장님이 뭘 보냐며 웃고는 검사용 조명을 오드리 얼굴 앞으로 끌어내린다.</w:t>
       </w:r>
     </w:p>
     <w:p>
@@ -428,7 +428,7 @@
           <w:b w:val="0"/>
           <w:sz w:val="20"/>
         </w:rPr>
-        <w:t>티파니는 돌아가는 날을 오드리 무릎 쪽으로 천천히 내리며, 장님으로는 모자라니 다시는 못 걷게 해 주겠다고 웃는다. 오드리는 날이 다가오는 것을 처음부터 끝까지 다 본다. 하지만 눈을 피하면 보인다는 게 들킨다. 오드리는 허공 한 곳만 보며 버티다가, 날이 살에 닿고 나서야 비명을 지른다. 그때 복도 끝에서 구두 소리와 고함이 들리고, 티파니가 공구를 내던진다. 「마크야. 이 여자 밖으로 끌어내!」</w:t>
+        <w:t>티파니가 조명을 가장 세게 켜자, 붕대를 푼 지 하루도 안 된 오드리 눈에 흰빛이 쏟아진다. 수술한 의사는 일주일 동안 센 빛이나 약품이 눈에 닿으면 다시 멀 수 있다고 했었다. 티파니는 자기 다리를 찌른 값이라며 밤새 켜 두겠다고, 어차피 안 보이는 눈이니 감지 말라고 한다. 감으면 보인다는 뜻이라는 것이다. 오드리는 흰빛 한가운데를 똑바로 본 채 눈을 감지 않는다. 눈물이 턱까지 흘러내리고, 흰빛 속에서 티파니 얼굴이 조금씩 흐려진다.</w:t>
       </w:r>
     </w:p>
     <w:p>
@@ -454,7 +454,7 @@
           <w:b w:val="0"/>
           <w:sz w:val="20"/>
         </w:rPr>
-        <w:t>비서실장과 경호원들이 끈을 끊고 피 흘리는 오드리를 뒷문으로 끌고 나간다. 같은 시각 마크는 경호원들을 앞세우고 총을 든 채 병원 복도로 들어선다. 간호사들이 비명을 지르며 흩어지고 환자들이 휴대폰을 들자, 마크는 그 휴대폰들을 향해 걱정에 질린 남편 얼굴을 한다. 파란 불빛이 새는 지하실 문 앞에서 마크가 총을 치켜든다. 「누가 내 아내한테 손댔어?」</w:t>
+        <w:t>티파니는 상장식장에 있는 마크에게 영상 통화를 걸어, 조명 아래 묶인 오드리를 비춰 보여 준다. 흐려진 눈으로도 오드리는 화면 속 마크 얼굴을 알아본다. 리허설 무대 앞에 선 마크는 웃으며, 내일 오드리를 사진 찍는 자리에 세워야 할지도 모르니 오드리 얼굴에 멍이나 상처만 남기지 말라고 한다. 통화가 끊기자 티파니는 검사대 위 소독약 병을 집어 들고 오드리 눈 위로 기울인다. 「눈 속은 흔적이 안 남잖아.」</w:t>
       </w:r>
     </w:p>
     <w:p>
@@ -480,7 +480,7 @@
           <w:b w:val="0"/>
           <w:sz w:val="20"/>
         </w:rPr>
-        <w:t>문 안에는 피 묻은 쇠 의자와 잘린 끈뿐이다. 로비로 올라온 마크에게 티파니가 매달리고, 타일러는 아빠에게 그 장님 개가 죽었다고 자랑한다. 티파니는 그 여자가 방금 도망갔다고 둘러대지만, 경호원이 핏자국이 뒷마당 폐기물 처리장까지 이어진다고 보고한다. 그 시각 뒷마당 진흙 위에 내던져진 오드리는 쓰레기 더미 앞 녹슨 철창을 본다. 휴대폰 속 그 철창이다. 오드리가 뚫린 다리를 끌며 기어간다. 「베어, 엄마 여기 있어.」</w:t>
+        <w:t>응급실 의사가 눈에 들어가면 안 되는 약이라고 말리지만, 티파니는 장님 눈인데 뭐가 달라지냐며 병을 더 기울인다. 오드리는 병 끝에 약 방울이 맺혀 커지는 걸 다 본다. 피하면 보인다는 게 들키고, 버티면 다시 눈이 멀 수 있다. 오드리는 허공 한 곳만 보며 버틴다. 방울이 떨어지려는 순간 티파니 휴대폰이 다시 울리고, 스피커 너머 마크 목소리가 다급하다. 「그 여자, 지금 당장 병원 밖으로 빼.」</w:t>
       </w:r>
     </w:p>
     <w:p>
@@ -506,7 +506,7 @@
           <w:b w:val="0"/>
           <w:sz w:val="20"/>
         </w:rPr>
-        <w:t>우산을 쓴 마크가 티파니, 타일러, 응급실 의사와 함께 뒷마당으로 들어선다. 동물관리국 직원은 사람을 문 개라며 안락사 서류를 내민다. 철창 속 개는 얼굴이 데고 피범벅이지만, 목줄에는 웰스 가문 메달이 달려 있다. 3년 전 마크는 그 목줄을 강아지 목에 채우며, 네가 있으면 그 장님을 덜 상대해도 된다고 중얼거렸었다. 마크는 베어를 알아보고도 서류에 서명한다. 진흙에 엎드린 오드리가 그 펜 끝을 다 보고 있다는 걸 마크는 모른다.</w:t>
+        <w:t>티파니가 병을 거두는 사이 약 방울이 오드리 뺨에 떨어진다. 마크는 응급실 복도 영상 때문에 포스터 대표가 숨겨 둔 아내라는 말이 돌고, 기자들이 병원 정문에 몰려왔다고 한다. 3년 동안 아내를 한 번도 사람들 앞에 데려간 적이 없으니, 오늘 밤에도 아무도 그 얼굴을 보면 안 된다는 것이다. 티파니가 박제사가 베어를 싣고 마크 서명을 받으러 옆문 하차장으로 온다고 하자, 오드리는 그 말을 놓치지 않는다. 비서실장이 오드리를 끌고 뒷계단을 내려가다 칭얼대는 타일러를 안아 드는 사이, 오드리는 빗소리가 나는 비상문으로 뛰쳐나간다.</w:t>
       </w:r>
     </w:p>
     <w:p>
@@ -532,7 +532,7 @@
           <w:b w:val="0"/>
           <w:sz w:val="20"/>
         </w:rPr>
-        <w:t>철창이 트럭에 실리자 오드리는 다리를 끌며 쫓아가다가, 경호원에게 진흙 바닥에 얼굴을 눌린다. 경호원이 병원 물건을 훔친 눈먼 도둑이라고 하자, 마크가 다가와 오드리 머리채를 잡아 얼굴을 들어 올린다. 무릎이 뚫리고 입술이 터진 자기 아내다. 오드리는 마크 어깨 너머 허공에 눈을 둔다. 그때 응급실에서 따라 나온 환자 하나가 휴대폰을 들이댄다. 「저 여자, 아까 포스터 대표 부인이라던 사람이잖아!」</w:t>
+        <w:t>비상문 밖 옆문 하차장에는 박제소 이름이 적힌 흰 승합차가 빗속에 서 있고, 열린 뒷문 안 케이지에서 베어가 낑낑댄다. 오드리가 승합차로 달려가 케이지를 붙잡는 순간, 포스터 그룹 경호원들이 오드리를 낚아채 진흙 화단에 얼굴을 처박는다. 그 시각 병원 정문에서 마크는 걱정에 지친 남편 얼굴로 기자들 앞에 서 있다. 아내는 집에서 쉬고 있으니, 앞 못 보는 사람을 소문으로 다치게 하지 말아 달라는 것이다. 말을 마친 마크가 우산을 쓰고 옆문 하차장으로 걸어 들어온다.</w:t>
       </w:r>
     </w:p>
     <w:p>
@@ -558,7 +558,7 @@
           <w:b w:val="0"/>
           <w:sz w:val="20"/>
         </w:rPr>
-        <w:t>마크는 머리채를 놓고 일어선다. 타일러는 저 여자가 엄마 폰을 뺏고 자기를 때렸다고 울고, 티파니는 사진 한 장만 퍼져도 주가가 떨어진다며 마크를 잡아끈다. 마크는 휴대폰들을 향해 자기 아내는 지금 집에 있다고, 이 여자는 아내 행세로 돈을 뜯으려던 도둑이라고 말한다. 마크는 비서실장에게 이 여자를 노숙인 보호소에 넣어 내일 밤까지 못 나오게 하라고 이르고, 빗속 골목으로 끌려 나온 오드리 귀에 대고 속삭인다. 「들었지? 네 남편은 지금 집에 있대.」</w:t>
+        <w:t>박제사가 마크에게 박제 의뢰서를 내민다. 개 몸속 칩에 주인으로 등록된 사람이 마크라, 마크 서명이 있어야 손을 댈 수 있다는 것이다. 케이지 속 개는 얼굴이 데고 한쪽 눈이 흐린데도, 마크 목소리를 듣자 꼬리를 치며 케이지 틈으로 코를 내민다. 3년 전 마크는 이 개를 강아지 때 데려오며, 네가 있으면 그 장님을 덜 상대해도 된다고 중얼거렸었다. 마크는 베어를 알아보고도 의뢰서에 서명한다. 진흙에 얼굴이 눌린 오드리가 그 펜 끝을 다 보고 있다는 걸 마크는 모른다.</w:t>
       </w:r>
     </w:p>
     <w:p>
@@ -584,7 +584,7 @@
           <w:b w:val="0"/>
           <w:sz w:val="20"/>
         </w:rPr>
-        <w:t>노숙인 보호소 트럭을 기다리는 골목에 비가 쏟아지고, 오드리는 골목 입구에 모인 사람들에게 살려 달라고 소리친다. 청년 하나가 다가오려 하자 포스터 그룹 경비원이 총을 뽑아 청년과 오드리를 번갈아 겨눈다. 그 순간 헬기 소리가 골목에 울리고 서치라이트가 골목을 비춘다. 경비원 손에서 총이 날아가고, 무장한 사람들 사이로 오빠가 걸어 들어와 오드리를 끌어안는다. 「내 동생이야. 다 물러서.」</w:t>
+        <w:t>경호원이 병원에서 도망친 눈먼 도둑이라고 하자, 마크가 다가와 오드리 머리채를 잡아 얼굴을 들어 올린다. 진흙과 눈물 범벅에 눈이 벌겋게 부은 얼굴, 자기 아내다. 오드리는 마크 어깨 너머 허공에 눈을 둔 채, 마크 눈이 자기 얼굴에서 멈추는 것을 본다. 그때 응급실에서 따라 나온 환자 하나가 휴대폰을 들이댄다. 「저 여자, 아까 포스터 대표 부인이라던 사람이잖아!」</w:t>
       </w:r>
     </w:p>
     <w:p>
@@ -610,7 +610,7 @@
           <w:b w:val="0"/>
           <w:sz w:val="20"/>
         </w:rPr>
-        <w:t>오빠는 경비원 멱살을 잡아 컨테이너에 밀어붙인다. 경비원이 포스터 대표가 가만두지 않을 거라고 악을 쓰자, 오빠는 자기가 웰스 가문 장남이고, 경비원이 방금 총을 겨눈 여자가 웰스 가문 상속녀라고 말한다. 경비원이 몰랐다며 무릎을 꿇지만 FBI 요원들이 수갑을 채운다. 오빠가 병원부터 가자며 오드리를 안아 들자, 오드리는 오빠 옷깃을 움켜쥐고 동물관리국이 베어를 끌고 갔다고, 오늘 밤 안락사당한다고 울부짖는다. 오빠가 헬기를 향해 소리친다. 「헬기 돌려. 시립 보호소로!」</w:t>
+        <w:t>마크는 머리채를 놓고 일어선다. 뒤따라 나온 티파니는 사진 한 장만 퍼져도 내일 상장을 망친다며 마크를 잡아끌고, 타일러는 저 여자가 엄마 폰을 훔쳐봤다고 운다. 마크는 휴대폰들을 향해 자기 아내는 지금 집에 있고, 이 여자는 아내 행세로 돈을 뜯으려는 사람이라고 말한다. 그러고는 비서실장에게 이 여자를 개와 같이 박제소로 실어 보내 내일 밤까지 못 나오게 하라고 이른다. 승합차로 끌려가는 오드리 귀에 마크가 속삭인다. 「들었지? 네 남편은 지금 집에 있대.」</w:t>
       </w:r>
     </w:p>
     <w:p>
@@ -636,7 +636,7 @@
           <w:b w:val="0"/>
           <w:sz w:val="20"/>
         </w:rPr>
-        <w:t>그 시각 시립 유기견 보호소에서는 직원이 베어 목줄을 잡고 가스실 쪽으로 질질 끈다. 수의사가 칩을 찍어 보더니 주인이 있는 안내견이라며 막아서자, 보호소 경비원이 수의사 이마에 권총을 댄다. 포스터 대표가 돈까지 주면서 꼭 죽이라고 한 개라는 것이다. 수의사가 떨며 버티자 경비원이 직접 스위치를 내린다. 유리 너머 좁은 방에 엎드린 베어 위로 하얀 가스가 쏟아진다.</w:t>
+        <w:t>승합차 뒷칸에서 오드리는 케이지 틈으로 손을 넣어 베어를 쓰다듬는다. 베어의 부러진 갈비뼈가 오드리 손끝에 하나하나 걸리고, 오드리는 라운지에서 쇠봉이 내려온 횟수를 떠올린다. 아홉 번이었다. 베어가 오드리 손을 핥는다. 그 시각 폭풍 속에 뉴욕에 내린 오빠는, 인터넷에 퍼지는 영상에서 진흙투성이 동생 얼굴을 본다. 그 얼굴을 모르는 여자라고 말하는 마크 뒤로 박제소 이름이 적힌 승합차가 서 있다. 오빠가 차에 오르며 소리친다. 「저 박제소 주소 찾아. 지금 당장.」</w:t>
       </w:r>
     </w:p>
     <w:p>
@@ -662,7 +662,7 @@
           <w:b w:val="0"/>
           <w:sz w:val="20"/>
         </w:rPr>
-        <w:t>가스가 새어 나오는 지하 복도로 오빠가 반쯤 정신을 놓은 오드리를 안고 뛰어든다. 오빠가 가스실 유리에 총을 쏘고, 깨진 틈으로 기어 들어간 오드리가 베어 머리를 끌어안는다. 오드리 손끝에 베어의 부러진 갈비뼈가 하나하나 걸리고, 오드리는 라운지에서 센 숫자를 떠올린다. 쇠봉으로 아홉 번이었다. 고개를 든 오드리 눈에 복도 양쪽 철창마다 갇힌 개들이 보인다. 코피를 흘리며 주저앉은 보호소 경비원이, 오늘 밤 저 개들도 전부 가스실에 넣으라는 게 포스터 대표 지시였다고 털어놓는다.</w:t>
+        <w:t>도시 끝 박제소 작업장에는 선반마다 유리 눈알을 박은 짐승들이 서 있다. 비서실장은 오드리를 문 옆 의자에 묶고, 박제사는 서랍에서 파란 유리 눈알 두 개를 고른다. 아이가 파란 눈으로 해 달랬다는 것이다. 오드리는 박제사가 주사기에 약을 채우는 걸 다 보면서도, 소리만 듣는 척 허공을 향해 베어를 부른다. 비서실장 휴대폰으로 아침까지 타일러 방에 세워 놓으라는 티파니의 재촉이 온다. 박제사가 베어를 쇠 작업대 위로 끌어올리고, 바늘 끝을 앞다리에 댄다.</w:t>
       </w:r>
     </w:p>
     <w:p>
@@ -688,7 +688,7 @@
           <w:b w:val="0"/>
           <w:sz w:val="20"/>
         </w:rPr>
-        <w:t>오빠는 부하들에게 철창의 개들을 전부 저택으로 데려가고, 보호소 경비원은 FBI에 넘기라고 한다. 다음 날 아침 웰스 저택에서 눈을 뜬 오드리는 붕대 감은 손으로 베어부터 찾는다. 수의사들이 뼈를 맞췄고 베어는 아래층에서 자고 있다. 오빠는 마크가 한 짓을 하나도 빠짐없이 갚게 하겠다며, 네가 그놈 얼굴을 한 번도 못 본 게 차라리 다행이라고 한다. 오드리가 조용히 웃는다. 「오늘 밤에 볼 거야. 갚는 것도 내 손으로 할게.」</w:t>
+        <w:t>그 순간 오빠가 작업장 문을 걷어차고 웰스 가문 사람들과 들이닥친다. 비서실장은 박제사에게 당장 끝내라고 외치고 뒷문으로 빗속에 달아난다. 오빠가 의자에 묶인 오드리를 풀어 끌어안는 사이, 오드리는 오빠 옷깃을 움켜쥐고 베어부터 살려 달라고 소리친다. 바늘이 털 속으로 들어가는 순간, 오빠가 박제사 손목을 잡아 비튼다. 주사기가 바닥에 떨어져 구른다. 박제사가 무릎을 꿇으며 외친다. 「개 주인이 직접 서명했어요. 개가 그 사람을 보고 꼬리를 치는데도요.」</w:t>
       </w:r>
     </w:p>
     <w:p>
@@ -714,7 +714,7 @@
           <w:b w:val="0"/>
           <w:sz w:val="20"/>
         </w:rPr>
-        <w:t>오빠는 그 말에 오늘 밤 상장식이 열리는 건물을 통째로 사들이고, 오빠 사람들은 응급실 의사와 포스터 그룹 변호사를 찾아간다. 베어가 아직 걷지 못해서 오빠는 새 안내견을 데려온다. 오드리는 거울 앞에서 선글라스를 쓰고, 거울 속 자기 눈이 까맣게 가려지는 걸 본다. 오빠가 오드리 어깨를 잡는다. 「가서 제대로 보여 줘.」 그날 밤 상장식장으로 가는 리무진 안에서 오드리 휴대폰이 울린다. 화면에 '남편'이 뜬다.</w:t>
+        <w:t>오빠는 박제사가 내민 의뢰서에서 마크 포스터라는 서명을 읽는다. 다음 날 아침 웰스 저택, 수의사들이 베어의 부러진 갈비뼈를 맞추는 동안 오드리는 진흙 묻은 환자복 안에서 접힌 종이를 꺼내 핸드백에 넣는다. 오빠는 마크가 한 짓을 하나도 빠짐없이 갚게 하겠다며, 네가 그놈 얼굴을 한 번도 못 본 게 차라리 다행이라고 한다. 오드리가 조용히 웃는다. 「오늘 밤에 볼 거야. 갚는 것도 내 손으로 할게.」</w:t>
       </w:r>
     </w:p>
     <w:p>
@@ -740,7 +740,7 @@
           <w:b w:val="0"/>
           <w:sz w:val="20"/>
         </w:rPr>
-        <w:t>마크는 다정한 목소리로 어디냐고 묻는다. 어젯밤 진흙 속 그 여자가 당신인 줄 몰랐다고, 종 칠 때 꼭 옆에 있어 달라고 한다. 리무진이 멈추고, 오드리는 짙은 창 너머 로비에서 그 전화를 받는 마크를 본다. 마크는 당신만 기다린다고 말하면서 다른 손으로 티파니 허리를 감고 있다. 오드리가 유리 너머에서 다 보고 있다는 걸 마크는 모른다. 전화를 끊은 마크가 티파니에게 입을 맞추고, 오드리의 안내견이 레드카펫 위로 먼저 내려선다.</w:t>
+        <w:t>그날 오후 포스터 그룹에서 웰스 저택으로 연락이 온다. 어젯밤 영상 때문에 투자자들이 불안해하니, 종 칠 때 웰스 상속녀가 마크 옆에 서 있어야 한다는 것이다. 오빠는 당장 거절하려 하지만 오드리는 가겠다고 한다. 그러고는 베어가 살아 있다는 걸 아무도 모르게 해 달라고 오빠에게 부탁한다. 아직 쓰린 눈에 짙은 선글라스를 쓴 오드리는 흰 지팡이를 쥐고 혼자 리무진에 오른다. 상장식장 앞에 차가 닿을 무렵 휴대폰이 울린다. 마크다.</w:t>
       </w:r>
     </w:p>
     <w:p>
@@ -766,7 +766,7 @@
           <w:b w:val="0"/>
           <w:sz w:val="20"/>
         </w:rPr>
-        <w:t>입구에서 경비원이 오드리를 막아선다. 포스터 그룹 비공개 행사라 개는 못 들어온다는 것이다. 오드리가 안내견은 막을 수 없다고 하자, 빨간 드레스 손님이 개 데리고 동냥하러 왔냐며 오늘 입장권 값이 네 1년 치 월세보다 비싸다고 비웃는다. 경비원은 끌려 나갈지 개가 죽는 걸 볼지 고르라며 오드리 코앞까지 다가선다. 그때 로비 안쪽에서 정장 차림의 남자가 걸어 나온다. 「이 건물 주인이 누군지는 알고 하는 소리야?」</w:t>
+        <w:t>마크는 다정한 목소리로 어디냐고 묻는다. 어젯밤 진흙 속 그 여자가 당신인 줄 몰랐다고, 종 칠 때 꼭 옆에 있어 달라고 한다. 리무진이 멈추고, 오드리는 짙은 창 너머 로비에서 그 전화를 받는 마크를 본다. 마크는 당신만 기다린다고 말하면서 다른 손으로 티파니 허리를 감고 있다. 오드리가 유리 너머에서 다 보고 있다는 걸 마크는 모른다. 전화를 끊은 마크가 티파니에게 입을 맞추고 무대 뒤로 들어가자, 티파니는 입구 경호원들을 부른다.</w:t>
       </w:r>
     </w:p>
     <w:p>
@@ -792,7 +792,7 @@
           <w:b w:val="0"/>
           <w:sz w:val="20"/>
         </w:rPr>
-        <w:t>남자는 웰스 가문 대리인이다. 대리인이 내민 서류를 읽던 건물 관리인의 얼굴이 하얘진다. 이 건물은 어젯밤부터 웰스 가문 것이다. 경비원이 끌려 나가고, 대리인이 오드리에게 고개를 숙인다. 「웰스 양, 무대까지 모시겠습니다.」 하객들이 저 여자가 누구냐고 수군대는 사이, 회전문 앞에서 기다리던 비서실장의 얼굴이 굳는다. 비서실장이 마크를 찾아 안으로 뛰어간다.</w:t>
+        <w:t>티파니는 경호원들에게, 어젯밤 영상 속 사기꾼 장님이 올 테니 절대 들이지 말라는 게 대표님 지시라고 이른다. 오드리가 지팡이로 계단을 짚어 올라오자 경호원들이 앞을 막고, 티파니가 영상 속 그 사기꾼이라고 외친다. 손님들 휴대폰 플래시가 쓰린 눈 앞에서 연달아 터지고, 경호원이 오드리 지팡이를 걷어찬다. 바닥을 더듬는 오드리에게 티파니는 네 남편은 집에 있다니 너도 집에 가라며 웃는다. 지팡이를 찾아 쥔 오드리가 경호원에게 말한다. 「마크 포스터한테 전해. 50억 달러에 들어갈 웰스 가문 서명, 그 주인이 문밖에 서 있다고.」</w:t>
       </w:r>
     </w:p>
     <w:p>
@@ -818,7 +818,7 @@
           <w:b w:val="0"/>
           <w:sz w:val="20"/>
         </w:rPr>
-        <w:t>무대 옆에서 마크는 티파니에게, 종이 울리는 순간 위임장대로 50억 달러가 포스터 그룹에 묶인다고 웃는다. 티파니가 장님 마누라가 한몫 챙기러 왔나 보다고 하자, 마크는 종만 울리면 그 여자는 한 푼도 못 받는다고 받는다. 비서실장이 뛰어와 사모님이 웰스 대리인과 함께 들어왔다고 하지만, 무대 위 사회자는 벌써 카운트다운을 외친다. 하객들이 돌아보는 홀 가운데 통로로, 오드리가 안내견과 함께 걸어 들어온다.</w:t>
+        <w:t>경호원 무전을 받은 마크가 홀에서 뛰어나온다. 손님들 휴대폰이 전부 자기를 향하자, 마크는 오드리 어깨를 감싸고 자기 아내라고 말한다. 누군가 어젯밤 영상에서는 아내가 집에 있다고 하지 않았냐고 묻자, 마크는 비 오는 밤 진흙투성이 아내를 못 알아본 자기가 죽일 놈이라며 눈시울을 붉힌다. 입구에 선 티파니를 지나쳐 홀로 들어가며, 마크가 오드리 귀에 대고 속삭인다. 「종 칠 때 내 옆에서 웃기만 해. 그럼 어젯밤 일은 다 없던 걸로 해 줄게.」</w:t>
       </w:r>
     </w:p>
     <w:p>
@@ -844,7 +844,7 @@
           <w:b w:val="0"/>
           <w:sz w:val="20"/>
         </w:rPr>
-        <w:t>티파니가 오드리 앞을 막아서며 어떻게 들어왔냐고, 또 개를 끌고 왔냐고 소리친다. 티파니가 오드리 팔을 잡아채는 순간, 오드리 손바닥이 티파니 뺨을 정확히 때린다. 바닥에 나동그라진 티파니가 저 여자 보인다고, 장님인 척하는 거라고 외친다. 홀이 술렁이자 마크가 웃으며 나선다. 3년을 같이 산 자기가 안다고, 자기 아내는 빛 한 줄기도 못 본다고. 그러고는 티파니 뺨을 후려친다. 「내 아내야. 말조심해.」</w:t>
+        <w:t>홀 앞 무대에는 종이 걸려 있고, 그 옆 탁자에 오드리 서명이 들어간 위임장이 놓여 있다. 투자단 대표가 3년 동안 아무도 웰스 상속녀 얼굴을 본 적이 없다며 오드리를 살피자, 마크는 아내를 제일 잘 아는 건 자기라고 웃는다. 그러자 마크 팔을 잡고 있던 오드리가 투자단 대표에게 말한다. 남편한테서 다른 여자 향수 냄새가 나는데, 어제 공항 라운지에서 맡은 냄새와 똑같다는 것이다. 마크가 아내는 앞을 못 봐서 코가 예민할 뿐이라고 둘러대는 사이, 옆문으로 들어온 티파니가 오드리 팔을 잡아챈다.</w:t>
       </w:r>
     </w:p>
     <w:p>
@@ -870,7 +870,7 @@
           <w:b w:val="0"/>
           <w:sz w:val="20"/>
         </w:rPr>
-        <w:t>타일러가 달려 나와 장님 괴물이 엄마를 때렸다고 악을 쓰자, 마크는 아이를 밀쳐 낸다. 티파니가 넘어진 타일러를 끌어안고 당신 아들이라고 소리치자, 마크는 내 아들이라고 부르지 말라고 한다. 마크는 오드리 앞으로 돌아와 활짝 웃으며 손을 내민다. 걱정 많이 했다고, 사랑한다고, 서명 하나만 하고 종 칠 때 옆에만 서 있어 달라고. 오드리는 그 손을 잡지 않는다. 「지하실에서 저 여자가 내 무릎에 공구를 댈 때, 당신은 어디 있었어?」</w:t>
+        <w:t>티파니가 어떻게 들어왔냐고 소리치며 잡아끄는 순간, 오드리 손바닥이 티파니 뺨을 정확히 때린다. 바닥에 나동그라진 티파니가 저 여자 보인다고, 장님인 척하는 거라고 외친다. 홀이 술렁이자 마크가 웃으며 나선다. 3년을 같이 산 자기가 안다고, 자기 아내는 빛 한 줄기도 못 본다고. 그러고는 티파니 뺨을 후려친다. 「내 아내야. 말조심해.」</w:t>
       </w:r>
     </w:p>
     <w:p>
@@ -896,7 +896,7 @@
           <w:b w:val="0"/>
           <w:sz w:val="20"/>
         </w:rPr>
-        <w:t>마크는 맹세코 몰랐다고, 다 티파니가 자기 등 뒤에서 한 짓이라고 한다. 티파니가 거짓말이라고 소리치는 사이, 웰스 가문 사람들이 응급실 의사를 홀 가운데로 데리고 들어온다. 의사는 새 병동을 지어 준다는 티파니 말에 산소를 끊고 지하실을 내줬다고, 그 방에서 오간 말은 전부 휴대폰에 녹음해 뒀다고 털어놓는다. 그러자 마크 곁에 서 있던 포스터 그룹 변호사가 뒷걸음질 친다. 「위임장 서류는 제가 만들었지만, 사모님 서명은 대표님이 직접 하셨습니다.」</w:t>
+        <w:t>그때 타일러가 달려 나와 마크 다리에 매달리며, 아빠, 저 장님이 엄마를 때렸다고 운다. 투자자들 앞에서 아빠 소리가 울리자 마크는 아이를 떼어 내 밀쳐 버리고, 처음 보는 아이라고 한다. 티파니가 넘어진 타일러를 끌어안고 당신 아들이라고 악을 쓴다. 오드리가 아이 쪽으로 고개를 돌리고 말한다. 저 목소리는 어제 공항에서 자기 개 눈에 레이저를 쏘고 뜨거운 커피를 부은 아이 목소리라고. 「그런데 저 애는 왜 당신을 아빠라고 불러?」</w:t>
       </w:r>
     </w:p>
     <w:p>
@@ -922,7 +922,7 @@
           <w:b w:val="0"/>
           <w:sz w:val="20"/>
         </w:rPr>
-        <w:t>마크가 무대 위 종으로 몸을 날린다. 종만 울리면 아무도 자기를 못 막는다는 것이다. 웰스 가문 경호원들이 종 앞을 막아서자, 마크는 숨을 고르고 다시 오드리에게 두 손을 펴 보인다. 집에 가서 얘기하자고, 서명만 해 주면 원하는 건 뭐든 주겠다고. 오드리가 묻는다. 이 건물, 당신 회사, 오늘 밤 움직일 50억 달러, 그중에 당신 돈이 한 푼이라도 있냐고. 그 순간 무대 위 대형 화면에서 상장 영상이 꺼지고 병원 지하실이 뜬다.</w:t>
+        <w:t>마크는 미친 여자가 데려온 아이일 뿐이라며 오드리를 무대 쪽으로 이끈다. 사회자가 종 칠 시간이 다 됐다고 알리자, 오드리는 핸드백에서 진흙 묻은 종이를 꺼내 투자단 대표에게 내민다. 자기는 못 읽으니 대신 읽어 달라는 것이다. 종이에는 마크 글씨로 오드리 웰스라는 이름이 열네 번 적혀 있고, 아래로 갈수록 오드리 서명과 점점 비슷해진다. 투자단 대표가 탁자 위 위임장을 집어 종이 옆에 대 본다. 「마지막 줄 서명이, 이 위임장 서명이랑 똑같습니다.」</w:t>
       </w:r>
     </w:p>
     <w:p>
@@ -948,7 +948,7 @@
           <w:b w:val="0"/>
           <w:sz w:val="20"/>
         </w:rPr>
-        <w:t>화면 속 티파니가 쇠 의자에 묶인 오드리 무릎에 공구를 내리고, 스피커에서 의사가 녹음한 티파니 목소리가 나온다. 「마크가 종 칠 때까지만 숨겨 두래. 그다음엔 내 마음대로 하래.」 하객들이 뒷걸음질 치고, 포스터 그룹 임원 하나가 가짜라고 말 좀 하라고 소리친다. 마크는 영상은 AI로 만든 가짜고 녹음은 짜깁기라고 외친 뒤, 오드리를 가리킨다. 「저 사람은 앞을 못 봐요. 앞도 못 보는 여자가 대체 뭘 봤다는 겁니까?」</w:t>
+        <w:t>마크는 앞 못 보는 아내라서 3년 동안 서명은 늘 자기가 대신해 왔고, 아내도 다 안다고 한다. 오드리는 한 번도 허락한 적 없다고 받는다. 마크가 아내가 어젯밤 일로 놀라서 무슨 말을 하는지도 모른다고 하자, 오드리가 말을 잇는다. 그 종이는 어젯밤 자기 침대 옆 소파에서, 마크가 저 여자를 무릎에 앉힌 채 쓴 거라고. 투자자들이 한꺼번에 마크를 쳐다본다. 마크가 웃으며 오드리 앞에 선다. 「아내가 정말 뭘 봤는지, 직접 보여 드리죠.」</w:t>
       </w:r>
     </w:p>
     <w:p>
@@ -974,7 +974,7 @@
           <w:b w:val="0"/>
           <w:sz w:val="20"/>
         </w:rPr>
-        <w:t>오드리가 선글라스를 벗는다. 3년 동안 한 번도 마크와 마주친 적 없던 눈이 마크 눈을 똑바로 본다. 오드리가 하나씩 말한다. 티파니가 라운지에서 쇠봉으로 베어를 아홉 번 때린 것, 마크가 병원 복도에서 자기 손을 잡은 채 등 뒤로 티파니에게 나가라고 손짓한 것, 자기 침대 옆 소파에서 두 사람이 뒹군 것, 마크가 식판 위에서 자기 이름을 열네 번 연습한 것. 「그리고 어젯밤엔 진흙에 엎드린 내 얼굴을 들어서 똑바로 보고는, 모르는 여자라고 했지.」</w:t>
+        <w:t>마크가 오드리 선글라스 앞에서 손을 흔들고 손가락을 튕긴다. 그러고는 주먹을 쥐어 오드리 얼굴을 향해 휘두르다, 손가락 한 마디 앞에서 멈춘다. 오드리는 주먹이 날아오는 것을 처음부터 끝까지 다 본다. 하지만 마크 어깨 너머 허공에 눈을 둔 채 눈 한 번 깜빡이지 않는다. 손님들 사이에서 비명이 터지고, 마크가 주먹을 거두며 홀을 둘러본다. 「보셨죠? 저 사람은 앞을 못 봐요. 앞도 못 보는 여자가 대체 뭘 봤다는 겁니까?」</w:t>
       </w:r>
     </w:p>
     <w:p>
@@ -1000,7 +1000,7 @@
           <w:b w:val="0"/>
           <w:sz w:val="20"/>
         </w:rPr>
-        <w:t>홀이 조용해진다. 바닥에 주저앉은 티파니만 울다 웃으며, 자기가 보인다고 하지 않았냐고 소리친다. 3년을 같이 산 자기가 안다던 마크는 입을 열지 못한다. 마크가 다시 종으로 몸을 날리는 순간 홀 입구로 오빠가 들어선다. 감히 내 동생을 건드렸냐는 말에, 하객들 사이로 웰스 가문 장남이라는 말이 퍼진다. 그 위로 뉴스 앵커 목소리가 울린다. 포스터 그룹 주식 거래가 전면 중단됐고, 마크 포스터 명의의 모든 자산이 동결됐다는 것이다.</w:t>
+        <w:t>오드리가 선글라스를 벗는다. 무대 조명에 눈이 다시 쓰려 오지만, 3년 동안 한 번도 마크와 마주친 적 없던 눈이 마크 눈을 똑바로 본다. 오드리가 하나씩 말한다. 티파니가 라운지에서 쇠봉으로 베어를 아홉 번 때린 것, 마크가 응급실 복도에서 자기 손을 잡은 채 등 뒤로 티파니에게 나가라고 손짓한 것, 병실 소파에서 두 사람이 뒹군 것, 식판 위에서 자기 이름을 열네 번 연습한 것, 꼬리 치는 베어를 보고도 의뢰서에 서명한 것. 「그리고 진흙에 엎드린 내 얼굴을 들어서 똑바로 보고는, 모르는 여자라고 했지.」</w:t>
       </w:r>
     </w:p>
     <w:p>
@@ -1026,7 +1026,7 @@
           <w:b w:val="0"/>
           <w:sz w:val="20"/>
         </w:rPr>
-        <w:t>마크가 무릎으로 기어 오드리 발치에 엎드린다. 다 티파니가 꾸민 짓이라고, 사랑한다고, 한 번만 기회를 달라고. 그 순간 티파니가 마크에게 달려들어 재킷을 움켜쥐고, 자기한테 다 뒤집어씌우지 말라고, 당신도 다 알고 있지 않았냐고 악을 쓴다. 경호원들이 둘을 떼어 놓고 오빠가 바닥을 짚은 마크 손을 구둣발로 밟자, 마크는 울먹이며 베어는 괜찮냐고 묻는다. 3년 전 자기가 데려온 아이라고. 오드리는 베어가 살아 있다는 걸 말하지 않는다. 「죽었어. 당신이 서명한 그 서류대로.」</w:t>
+        <w:t>홀이 조용해진다. 바닥에 주저앉아 있던 티파니만 울다 웃으며, 자기가 보인다고 하지 않았냐고 소리친다. 3년을 같이 산 자기가 안다던 마크는 입을 열지 못한다. 그러다 마크가 투자단 대표를 밀치고 무대 위 종으로 달려간다. 종만 울리면 위임장대로 50억 달러가 들어온다는 것이다. 누가 막기도 전에 마크가 종 줄을 잡아당기고, 홀 가득 종소리가 울린다.</w:t>
       </w:r>
     </w:p>
     <w:p>
@@ -1052,7 +1052,7 @@
           <w:b w:val="0"/>
           <w:sz w:val="20"/>
         </w:rPr>
-        <w:t>마크가 바닥에 엎드려 소리 내어 우는 사이 경찰들이 들어온다. 형사는 살인미수와 불법 감금, 사기 혐의로 마크와 티파니, 비서실장까지 체포한다. 타일러가 엄마 아빠를 놓으라며 경찰 다리에 매달리고, 수갑을 찬 마크와 티파니가 레드카펫 계단을 끌려 내려간다. 마크는 경찰차 안에서도 오드리를 부르며 사랑한다고 외친다. 차들이 떠나자 웰스 가문 집사가 다가와, 포스터 그룹이 곧 파산해 가진 것 전부가 경매에 나온다고 보고한다. 오드리가 답한다. 「하나도 남기지 말고 사.」</w:t>
+        <w:t>종소리가 잦아들어도, 무대 위 화면 속 50억 달러는 한 푼도 들어오지 않는다. 오드리가 마이크 앞에 서서, 웰스 가문 서명은 자기 것이고 자기는 아무 데도 서명한 적이 없다고 말한다. 투자단 대표가 위임장을 반으로 찢고, 투자자들이 하나둘 일어나 홀을 나간다. 마크는 나가는 투자자 소매를 붙잡다 뿌리쳐지고, 고개를 돌려 티파니를 가리킨다. 「전부 저 여자가 혼자 한 짓입니다. 저는 아무것도 몰랐어요.」</w:t>
       </w:r>
     </w:p>
     <w:p>
@@ -1078,7 +1078,7 @@
           <w:b w:val="0"/>
           <w:sz w:val="20"/>
         </w:rPr>
-        <w:t>경매장에 포스터 그룹 것들이 하나씩 올라온다. 본사 건물, 마크의 전용기, 마크가 티파니에게 사 준 펜트하우스. 다른 손님들은 웰스 가문 패들이 올라갈 때마다 손을 내린다. 마지막으로 그날 밤 끝내 울리지 못한 상장식 종이 나오자 사람들이 웃는다. 오드리가 패들을 든다. 경매사가 세 번 값을 부르고, 아무도 따라오지 않자 망치를 내리친다.</w:t>
+        <w:t>티파니가 마크에게 달려들어 재킷 깃을 움켜쥐고, 마크는 티파니 머리채를 잡아 떼어 내려 한다. 경호원들이 둘을 떼어 놓는 사이 티파니가 악을 쓴다. 아내를 자기한테 넘긴 게 누구고, 개를 죽이는 종이에 서명한 게 누구냐고. 그러고는 홀이 다 듣도록 마크가 병실에서 한 말을 그대로 외친다. 「종 칠 때까지만 아무도 못 보게 해. 그다음엔 네 마음대로 해. 당신 입으로 그랬잖아!」</w:t>
       </w:r>
     </w:p>
     <w:p>
@@ -1104,7 +1104,7 @@
           <w:b w:val="0"/>
           <w:sz w:val="20"/>
         </w:rPr>
-        <w:t>그날 밤 TV 뉴스는 안내견 학대 사건에 온 나라가 분노하고, 쉰 개가 넘는 도시에서 시위가 열렸다고 전한다. 웰스 저택 거실에서 베어는 붕대를 감은 채 오드리 무릎에 머리를 얹고 있다. 오빠는 동생 눈이 보인다는 걸 그날 무대에서 처음 알았다며, 그 눈으로 그놈들 얼굴을 다 봤냐고 묻는다. 오드리는 베어 목을 쓸어내리며 하나도 빠짐없이 봤다고 답한다. 오빠는 변호사들을 불러, 온 나라가 보는 앞에서 재판을 열게 하라고 한다.</w:t>
+        <w:t>경호원들 손을 뿌리친 마크가 무릎으로 기어 와 오드리 발치에 엎드린다. 다 티파니한테 속아서 그랬다고, 사랑한다고, 한 번만 기회를 달라고 빈다. 그러다 울먹이며 베어는 괜찮냐고 묻는다. 3년 전 자기가 데려온 아이라고. 오드리는 베어가 지금 웰스 저택에서 자고 있다는 걸 말하지 않는다. 「죽었어. 당신이 서명한 그 종이대로.」</w:t>
       </w:r>
     </w:p>
     <w:p>
@@ -1130,7 +1130,7 @@
           <w:b w:val="0"/>
           <w:sz w:val="20"/>
         </w:rPr>
-        <w:t>재판 날, 맨해튼 연방법원 앞은 피켓을 든 사람들로 가득하다. 수의를 입은 티파니, 마크, 비서실장이 피고석에 나란히 앉고, 오드리는 선글라스 없이 방청석 맨 앞줄에 앉는다. 검사가 저들은 안내견을 고문하고 보호소 개들을 가스실에 넣으려 했다고 하자, 티파니가 벌떡 일어나 영상은 웰스가 조작했고 고작 개 한 마리 아니냐고 소리친다. 머리를 민 마크는 판사만 보며 차분하게 말한다. 「재판장님, 저는 그 지하실에 가 본 적도 없습니다.」</w:t>
+        <w:t>마크가 바닥에 엎드려 소리 내어 우는 사이, 오빠가 형사들을 데리고 홀로 들어온다. 형사들은 살인미수와 감금, 서명 위조 혐의로 마크와 티파니, 옆문으로 빠져나가던 비서실장까지 붙잡는다. 타일러가 엄마 아빠를 놓으라며 형사 다리에 매달리고, 마크는 끌려 나가면서도 오드리 이름을 부르며 사랑한다고 외친다. 홀이 비자 오빠는 선글라스 없이 자기를 올려다보는 동생 눈을 보고, 언제부터 보였냐고 묻는다. 「결혼기념일 아침에. 그 사람 얼굴을 제일 먼저 보려고.」</w:t>
       </w:r>
     </w:p>
     <w:p>
@@ -1156,7 +1156,7 @@
           <w:b w:val="0"/>
           <w:sz w:val="20"/>
         </w:rPr>
-        <w:t>티파니가 마크 쪽으로 몸을 돌린다. 3년 전 그 개를 데려온 것도 장님을 덜 상대하려고 그랬다고 자기한테 웃으며 말하지 않았냐고, 베어한테 무슨 짓을 하는지 다 알면서 모른 척하지 않았냐고 악을 쓴다. 집행관이 티파니를 붙잡아 앉히는 사이, 마크의 변호인이 서류를 챙겨 일어선다. 증거가 다 있는데도 의뢰인들이 법정에서까지 거짓말을 한다며 변호를 그만두겠다는 것이다. 마크가 수갑 찬 손으로 탁자를 내리친다. 「얼마면 돼? 두 배 줄게!」</w:t>
+        <w:t>그날 밤 웰스 저택으로 포스터 그룹 소식이 들어온다. 마크는 50억 달러가 들어온다는 약속 하나로 은행 빚을 잔뜩 끌어다 썼고, 그 돈이 끊기자 은행들이 내일 정오까지 전부 갚으라고 한다는 것이다. 갚지 못하면 포스터 그룹은 문을 닫는다. 오빠는 그냥 무너지게 두자고 하지만, 오드리는 무릎에 머리를 얹은 베어를 쓰다듬으며 고개를 젓는다. 「그 빚, 내가 다 사.」</w:t>
       </w:r>
     </w:p>
     <w:p>
@@ -1182,7 +1182,7 @@
           <w:b w:val="0"/>
           <w:sz w:val="20"/>
         </w:rPr>
-        <w:t>변호인이 나가자 검사는 오드리를 증인석으로 부른다. 오드리는 베어가 3년 동안 자기 눈이었고 저 사람들이 그 눈을 때리고 가스실에 넣었다고 말한 뒤, 베어를 들여보내 달라고 한다. 법정 문이 열리고, 다리를 저는 베어가 바닥을 가로질러 걸어 들어온다. 베어는 피고석까지 가서, 3년 전 자기를 데려온 마크 무릎에 앞발을 올린다. 마크는 수갑 찬 손으로 베어 얼굴을 감싸다가 굳는다. 「베어? 너 왜 살아 있어?」</w:t>
+        <w:t>다음 날 정오 직전, 은행 사람들이 모인 포스터 그룹 회의실에서 오드리는 빚을 전부 갚아 주는 대신 회사를 넘겨받는 서류 앞에 앉는다. 마크가 식판 위에서 열네 번 연습했던 그 이름을, 오드리는 한 번에 쓴다. 오드리는 대표실의 마크 의자에 앉아, 건물 꼭대기에서 포스터라는 글자를 떼라고 지시한다. 같은 시각 구치소의 마크는 변호사가 내민 같은 서류를 받아 들고, 맨 아래 서명을 보며 종이를 움켜쥔다.</w:t>
       </w:r>
     </w:p>
     <w:p>
@@ -1208,7 +1208,7 @@
           <w:b w:val="0"/>
           <w:sz w:val="20"/>
         </w:rPr>
-        <w:t>방청석에서 야유가 쏟아지고, 마크는 그런 뜻이 아니었다며 판사에게 매달린다. 그러다 이번엔 타일러를 꺼낸다. 오드리에게 아이 없는 집이 조용해서 더 좋다고 하던 마크가, 여섯 살 아들이 아빠 없이 자라게 둘 수는 없다며 눈물을 쏟는다. 오드리는 증인석에서 그 얼굴을 끝까지 본다. 그 순간 티파니가 소리 내어 웃는다. 「아들? 그 애 아빠는 당신이 아니야.」</w:t>
+        <w:t>몇 주 뒤 법정에서 마크는 그날 밤 의뢰서에 서명할 때 그 개가 베어인 줄 몰랐다고 말한다. 비 오는 밤이었고 서류에 서명만 했을 뿐이라는 것이다. 증인석에 앉은 오드리는 판사에게 증인 하나를 더 들여보내 달라고 한다. 법정 문이 열리고, 다리를 저는 베어가 혼자 걸어 들어온다. 베어는 곧장 피고석으로 가서, 3년 전 자기를 데려온 마크 무릎에 코를 얹고 꼬리를 친다. 마크가 수갑 찬 손으로 베어 얼굴을 감싸다 굳는다. 「베어? 너 왜 살아 있어?」</w:t>
       </w:r>
     </w:p>
     <w:p>
@@ -1234,7 +1234,7 @@
           <w:b w:val="0"/>
           <w:sz w:val="20"/>
         </w:rPr>
-        <w:t>티파니가 수갑 찬 손으로 피고석 끝을 가리킨다. 비서실장이다. 마크가 6년 동안 자기 아들인 줄 알고 키운 아이가 비서실장 아이라는 것이다. 비서실장은 고개를 들지 못하고, 오드리는 병원 지하에서 비서실장 목에 익숙하게 매달리던 타일러를 떠올린다. 비서실장에게 달려들던 마크가 집행관들에게 바닥에 눌린다. 판사가 망치를 내리친다. 비서실장은 살인미수와 감금으로 종신형, 티파니는 가석방 없는 종신형이다. 티파니가 무릎으로 기어 와 오드리에게 빈다. 「오드리, 타일러 봐서라도 한 번만.」</w:t>
+        <w:t>법정이 술렁이고, 검사는 베어인 줄 몰랐다는 사람이 어떻게 이름부터 부르냐고 묻는다. 마크는 그런 뜻이 아니었다며 판사에게 매달리다가, 이번엔 타일러를 꺼낸다. 상장식에서 처음 보는 아이라며 밀쳐 냈던 타일러를, 이제는 여섯 살 아들이라 부르며 아빠 없이 자라게 할 수 없다고 눈물을 쏟는다. 그 순간 피고석의 티파니가 소리 내어 웃는다. 「아들? 그 애 아빠는 당신이 아니야.」</w:t>
       </w:r>
     </w:p>
     <w:p>
@@ -1260,7 +1260,7 @@
           <w:b w:val="0"/>
           <w:sz w:val="20"/>
         </w:rPr>
-        <w:t>오드리는 대답하지 않는다. 판사는 마크에게 사기와 돈세탁, 폭행으로 징역 30년과 전 재산 몰수를 선고한다. 집행관에게 끌려가던 마크가 몸을 비틀며 오드리를 부른다. 억울하다고, 사랑한다고, 함께한 3년은 전부 진짜였다고. 오드리가 마크를 똑바로 본다. 「그럼 앞으로 30년 동안, 그 3년을 하루씩 세면서 살아.」</w:t>
+        <w:t>티파니가 수갑 찬 손으로 피고석 끝의 비서실장을 가리킨다. 마크가 6년 동안 자기 아들인 줄 알고 키운 아이가 비서실장 아이라는 것이다. 비서실장은 고개를 들지 못하고, 오드리는 병실에서 비서실장 목에 익숙하게 매달리던 타일러를 떠올린다. 비서실장에게 달려들던 마크가 집행관들에게 바닥에 눌린 채, 판사가 선고를 내린다. 비서실장은 징역 15년, 티파니는 징역 25년, 마크는 징역 35년에 전 재산 몰수다. 티파니가 무릎으로 기어 와 오드리에게 빈다. 「타일러 봐서라도 한 번만.」</w:t>
       </w:r>
     </w:p>
     <w:p>
@@ -1286,7 +1286,7 @@
           <w:b w:val="0"/>
           <w:sz w:val="20"/>
         </w:rPr>
-        <w:t>한 달 뒤 최고보안 교도소 면회실, 머리를 민 마크가 유리에 이마를 붙이고 수화기를 쥔다. 잘못했다고, 꺼내 달라고, 여기서 죽기 싫다고 빈다. 오드리가 대꾸하지 않자 마크는 3년 동안 네 눈이 돼 준 건 자기였다고, 개 한 마리 때문에 내 인생을 망쳤냐고 유리를 친다. 오드리 곁에는 다 나은 베어가 앉아 있다. 오드리는 결혼 3주년 아침에 붕대를 풀었다고 말한다. 「태어나서 처음 본 당신 얼굴은, 티파니랑 키스하던 얼굴이었어.」</w:t>
+        <w:t>오드리는 끝내 대답하지 않는다. 한 달 뒤 교도소 면회실, 머리를 민 마크가 유리 너머에서 수화기를 쥐고 잘못했다고, 꺼내 달라고, 여기서 죽기 싫다고 빈다. 오드리가 대꾸하지 않자 마크는 베어도 법정에서 자기를 보고 꼬리를 쳤다며, 개도 용서했는데 왜 너는 못 하냐고 유리를 친다. 오드리 발치에는 다 나은 베어가 앉아 있다. 오드리는 결혼 3주년 아침에 붕대를 풀었다고 말한다. 「태어나서 처음 본 당신 얼굴은, 티파니랑 키스하던 얼굴이었어.」</w:t>
       </w:r>
     </w:p>
     <w:p>
@@ -1312,7 +1312,7 @@
           <w:b w:val="0"/>
           <w:sz w:val="20"/>
         </w:rPr>
-        <w:t>오드리가 수화기를 내려놓고 나간 그 시각, 여자 교도소 복도에서는 티파니가 무릎을 끌어안고 웅크려 있다. 죄수들이 몰려와 개 고문한 포스터 부인이 여기 있다며 티파니 머리채를 잡아챈다. 티파니가 돈이 있다고, 다 주겠다고 빌자 누군가 더러운 걸레 물을 티파니 머리에 쏟아붓는다. 포스터는 감옥에 갔고 네 돈도 없다는 말에 죄수들이 웃는다. 철창 너머로 교도관이 지나가지만 앞만 보고 걷는다.</w:t>
+        <w:t>오드리가 수화기를 내려놓고 베어와 함께 돌아선 그 시각, 여자 교도소 식당에서는 죄수들이 티파니를 둘러싼다. 공항 라운지 영상을 본 죄수 하나가 티파니 칫솔을 바닥 저편으로 던지고, 장님한테 하던 대로 물어 와 보라고 한다. 티파니가 무릎으로 기어가 칫솔에 손을 뻗자, 그 죄수가 운동화로 티파니 손을 밟는다. 「바로 앞에 있잖아. 안 보여?」</w:t>
       </w:r>
     </w:p>
     <w:p>
@@ -1338,7 +1338,7 @@
           <w:b w:val="0"/>
           <w:sz w:val="20"/>
         </w:rPr>
-        <w:t>같은 날 타일러는 법원이 정해 준 후견인 집에서 해진 옷을 입고 빵 조각을 받는다. 자꾸 울면 고아원에 보내겠다는 말에 타일러는 아빠를 부르다 입을 다문다. 아빠라고 부를 사람은 둘인데 둘 다 감옥에 있다. 그 사이 시내 한쪽에서는 새 동물 보호소 앞에 레드카펫이 깔린다. 간판에는 베어의 이름이 걸려 있다. 오빠와 오드리가 나란히 서고 베어가 그 사이에 앉는다. 오드리가 리본을 자르자 흰 비둘기들이 날아오른다.</w:t>
+        <w:t>같은 날 아동 복지 센터 대기실에서 타일러는 작은 가방을 안고 앉아 있다. 담당자가 데려갈 사람을 찾아 전화를 돌리지만, 마크는 교도소에서 자기 아이가 아니라고 답해 오고, 비서실장과 티파니도 감옥에 있다. 해가 질 때까지 대기실 문은 한 번도 열리지 않는다. 타일러는 가방에서 공항에서 쓰던 레이저 펜을 꺼내, 아무도 없는 벽에 빨간 점을 비춘다.</w:t>
       </w:r>
     </w:p>
     <w:p>
@@ -1364,7 +1364,7 @@
           <w:b w:val="0"/>
           <w:sz w:val="20"/>
         </w:rPr>
-        <w:t>보호소 앞 잔디밭에서 입양 행사가 열리고, 시립 보호소 가스실 앞 철창에 갇혀 있던 개들이 하나씩 새 가족 품에 안긴다. 오빠는 오늘만 쉰 마리가 집을 찾았다고 말한다. 오드리는 무대에서 내려와 베어 앞에 무릎을 꿇는다. 3년 동안 자기 눈이 돼 준 개의 얼굴을, 오드리는 이제 자기 눈으로 본다. 베어의 한쪽 눈은 레이저에 흐려졌고 귀에는 덴 자국이 남았지만, 꼬리는 쉬지 않고 흔들린다. 오드리가 베어를 두 팔로 끌어안고 털에 얼굴을 묻는다.</w:t>
+        <w:t>몇 달 뒤 햇빛 좋은 강가 공원, 오드리는 베어 몸에서 안내견 하네스를 벗겨 낸다. 이제 베어는 오드리 앞에서 길을 찾지 않아도 된다. 다 나은 눈으로 선글라스를 벗은 오드리가 베어 앞에 무릎을 꿇는다. 붕대를 풀고 나서 햇빛 아래에서 베어 얼굴을 보는 건 처음이다. 레이저에 다친 한쪽 눈은 흐려졌고 귀에는 덴 자국이 남았지만, 꼬리는 쉬지 않고 흔들린다. 오드리가 베어를 두 팔로 끌어안고, 마지막 컷은 베어 털에 얼굴을 묻은 오드리를 잡는다.</w:t>
       </w:r>
     </w:p>
     <w:sectPr>

</xml_diff>